<commit_message>
Fix business registration document generation
</commit_message>
<xml_diff>
--- a/assets/templates/word/business_registration/1. Giấy đề nghị thành lập doanh nghiệp.docx
+++ b/assets/templates/word/business_registration/1. Giấy đề nghị thành lập doanh nghiệp.docx
@@ -2578,34 +2578,7 @@
         </w:rPr>
       </w:pPr>
       <w:r>
-        <w:rPr>
-          <w:rFonts w:eastAsia="Times New Roman"/>
-          <w:color w:val="000000" w:themeColor="text1"/>
-          <w:sz w:val="26"/>
-          <w:szCs w:val="26"/>
-          <w:lang w:val="vi-VN" w:eastAsia="zh-CN"/>
-        </w:rPr>
-        <w:t>Tên công ty viết bằng tiếng nước ngoài:</w:t>
-      </w:r>
-      <w:r>
-        <w:rPr>
-          <w:rFonts w:eastAsia="Times New Roman"/>
-          <w:color w:val="000000" w:themeColor="text1"/>
-          <w:sz w:val="26"/>
-          <w:szCs w:val="26"/>
-          <w:lang w:val="vi-VN" w:eastAsia="zh-CN"/>
-        </w:rPr>
-        <w:t>……………………………………..</w:t>
-      </w:r>
-      <w:r>
-        <w:rPr>
-          <w:rFonts w:eastAsia="Times New Roman"/>
-          <w:color w:val="000000" w:themeColor="text1"/>
-          <w:sz w:val="26"/>
-          <w:szCs w:val="26"/>
-          <w:lang w:val="vi-VN" w:eastAsia="zh-CN"/>
-        </w:rPr>
-        <w:t xml:space="preserve"> </w:t>
+        <w:t xml:space="preserve">Tên công ty viết bằng tiếng nước ngoài: [company_english_name] </w:t>
       </w:r>
     </w:p>
     <w:p>
@@ -2627,39 +2600,7 @@
         </w:rPr>
       </w:pPr>
       <w:r>
-        <w:rPr>
-          <w:rFonts w:eastAsia="Times New Roman"/>
-          <w:color w:val="000000" w:themeColor="text1"/>
-          <w:sz w:val="26"/>
-          <w:szCs w:val="26"/>
-          <w:lang w:val="vi-VN" w:eastAsia="zh-CN"/>
-        </w:rPr>
-        <w:lastRenderedPageBreak/>
-        <w:t>Tên công ty viết tắt</w:t>
-      </w:r>
-      <w:bookmarkEnd w:id="1"/>
-      <w:r>
-        <w:rPr>
-          <w:rFonts w:eastAsia="Times New Roman"/>
-          <w:bCs/>
-          <w:color w:val="000000" w:themeColor="text1"/>
-          <w:sz w:val="26"/>
-          <w:szCs w:val="26"/>
-          <w:lang w:val="vi-VN" w:eastAsia="zh-CN"/>
-        </w:rPr>
-        <w:t>:</w:t>
-      </w:r>
-      <w:bookmarkEnd w:id="2"/>
-      <w:r>
-        <w:rPr>
-          <w:rFonts w:eastAsia="Times New Roman"/>
-          <w:bCs/>
-          <w:color w:val="000000" w:themeColor="text1"/>
-          <w:sz w:val="26"/>
-          <w:szCs w:val="26"/>
-          <w:lang w:val="vi-VN" w:eastAsia="zh-CN"/>
-        </w:rPr>
-        <w:t>………………………………………………………………</w:t>
+        <w:t>Tên công ty viết tắt: [company_short_name]</w:t>
       </w:r>
     </w:p>
     <w:p>

</xml_diff>